<commit_message>
Publish the current CIT website so the source can be reviewed on GitHub.
Snapshots the bilingual Next.js site, admin/CMS layer, team portraits and hero media that previously lived only in the local working tree.

Co-authored-by: Cursor <cursoragent@cursor.com>
</commit_message>
<xml_diff>
--- a/11_CURSOR_GOAL_MASTER_PROMPT — CIT Website.docx
+++ b/11_CURSOR_GOAL_MASTER_PROMPT — CIT Website.docx
@@ -6149,6 +6149,404 @@
           <w:rtl w:val="0"/>
         </w:rPr>
         <w:t xml:space="preserve">Never allow the live-reference layer to override approved CIT facts, the Build Pack, or the selected original CIT design concept. Never create a Frankenstein page by implementing different benchmark sections in their native visual styles.</w:t>
+      </w:r>
+    </w:p>
+    <w:p>
+      <w:pPr>
+        <w:rPr/>
+      </w:pPr>
+      <w:r>
+        <w:rPr>
+          <w:rtl w:val="0"/>
+        </w:rPr>
+      </w:r>
+    </w:p>
+    <w:p>
+      <w:pPr>
+        <w:rPr/>
+      </w:pPr>
+      <w:r>
+        <w:rPr>
+          <w:rtl w:val="0"/>
+        </w:rPr>
+        <w:t xml:space="preserve">APPENDIX B — TEMPORARY UASG IMAGE SOURCING</w:t>
+      </w:r>
+    </w:p>
+    <w:p>
+      <w:pPr>
+        <w:rPr/>
+      </w:pPr>
+      <w:r>
+        <w:rPr>
+          <w:rtl w:val="0"/>
+        </w:rPr>
+      </w:r>
+    </w:p>
+    <w:p>
+      <w:pPr>
+        <w:rPr/>
+      </w:pPr>
+      <w:r>
+        <w:rPr>
+          <w:rtl w:val="0"/>
+        </w:rPr>
+        <w:t xml:space="preserve">For V1 visual completeness, you MAY use suitable publicly accessible images from the official UASG website and its UASG-controlled subdomains as TEMPORARY development/preview assets:</w:t>
+      </w:r>
+    </w:p>
+    <w:p>
+      <w:pPr>
+        <w:rPr/>
+      </w:pPr>
+      <w:r>
+        <w:rPr>
+          <w:rtl w:val="0"/>
+        </w:rPr>
+        <w:t xml:space="preserve">https://uacg.bg/</w:t>
+      </w:r>
+    </w:p>
+    <w:p>
+      <w:pPr>
+        <w:rPr/>
+      </w:pPr>
+      <w:r>
+        <w:rPr>
+          <w:rtl w:val="0"/>
+        </w:rPr>
+      </w:r>
+    </w:p>
+    <w:p>
+      <w:pPr>
+        <w:rPr/>
+      </w:pPr>
+      <w:r>
+        <w:rPr>
+          <w:rtl w:val="0"/>
+        </w:rPr>
+        <w:t xml:space="preserve">Purpose: the first V1 should contain real, contextually relevant photography instead of empty image slots or generic technology stock imagery. These images are placeholders and are expected to be replaced later by purpose-made CIT photography/visual assets.</w:t>
+      </w:r>
+    </w:p>
+    <w:p>
+      <w:pPr>
+        <w:rPr/>
+      </w:pPr>
+      <w:r>
+        <w:rPr>
+          <w:rtl w:val="0"/>
+        </w:rPr>
+      </w:r>
+    </w:p>
+    <w:p>
+      <w:pPr>
+        <w:rPr/>
+      </w:pPr>
+      <w:r>
+        <w:rPr>
+          <w:rtl w:val="0"/>
+        </w:rPr>
+        <w:t xml:space="preserve">Preferred image themes:</w:t>
+      </w:r>
+    </w:p>
+    <w:p>
+      <w:pPr>
+        <w:rPr/>
+      </w:pPr>
+      <w:r>
+        <w:rPr>
+          <w:rtl w:val="0"/>
+        </w:rPr>
+        <w:t xml:space="preserve">- UASG campus, buildings, architectural spaces and recognizable university environment;</w:t>
+      </w:r>
+    </w:p>
+    <w:p>
+      <w:pPr>
+        <w:rPr/>
+      </w:pPr>
+      <w:r>
+        <w:rPr>
+          <w:rtl w:val="0"/>
+        </w:rPr>
+        <w:t xml:space="preserve">- laboratories, workshops, technical facilities or research/teaching environments;</w:t>
+      </w:r>
+    </w:p>
+    <w:p>
+      <w:pPr>
+        <w:rPr/>
+      </w:pPr>
+      <w:r>
+        <w:rPr>
+          <w:rtl w:val="0"/>
+        </w:rPr>
+        <w:t xml:space="preserve">- architecture, construction, infrastructure, geodesy, engineering and spatial/urban contexts;</w:t>
+      </w:r>
+    </w:p>
+    <w:p>
+      <w:pPr>
+        <w:rPr/>
+      </w:pPr>
+      <w:r>
+        <w:rPr>
+          <w:rtl w:val="0"/>
+        </w:rPr>
+        <w:t xml:space="preserve">- students, researchers or teaching activity where the image feels natural and institutionally credible;</w:t>
+      </w:r>
+    </w:p>
+    <w:p>
+      <w:pPr>
+        <w:rPr/>
+      </w:pPr>
+      <w:r>
+        <w:rPr>
+          <w:rtl w:val="0"/>
+        </w:rPr>
+        <w:t xml:space="preserve">- project/model/prototype/technical-work imagery that visually supports research, systems, engineering or applied science.</w:t>
+      </w:r>
+    </w:p>
+    <w:p>
+      <w:pPr>
+        <w:rPr/>
+      </w:pPr>
+      <w:r>
+        <w:rPr>
+          <w:rtl w:val="0"/>
+        </w:rPr>
+      </w:r>
+    </w:p>
+    <w:p>
+      <w:pPr>
+        <w:rPr/>
+      </w:pPr>
+      <w:r>
+        <w:rPr>
+          <w:rtl w:val="0"/>
+        </w:rPr>
+        <w:t xml:space="preserve">Selection rule: choose images because they fit the CIT visual story and Stanford-HAI-inspired editorial composition, not merely because they are available. Prefer strong, clean, high-resolution photographs with useful crop flexibility and enough negative space for editorial layouts.</w:t>
+      </w:r>
+    </w:p>
+    <w:p>
+      <w:pPr>
+        <w:rPr/>
+      </w:pPr>
+      <w:r>
+        <w:rPr>
+          <w:rtl w:val="0"/>
+        </w:rPr>
+      </w:r>
+    </w:p>
+    <w:p>
+      <w:pPr>
+        <w:rPr/>
+      </w:pPr>
+      <w:r>
+        <w:rPr>
+          <w:rtl w:val="0"/>
+        </w:rPr>
+        <w:t xml:space="preserve">Avoid where possible:</w:t>
+      </w:r>
+    </w:p>
+    <w:p>
+      <w:pPr>
+        <w:rPr/>
+      </w:pPr>
+      <w:r>
+        <w:rPr>
+          <w:rtl w:val="0"/>
+        </w:rPr>
+        <w:t xml:space="preserve">- ceremonial/event group photos with no connection to the page story;</w:t>
+      </w:r>
+    </w:p>
+    <w:p>
+      <w:pPr>
+        <w:rPr/>
+      </w:pPr>
+      <w:r>
+        <w:rPr>
+          <w:rtl w:val="0"/>
+        </w:rPr>
+        <w:t xml:space="preserve">- text-heavy posters, screenshots or administrative graphics;</w:t>
+      </w:r>
+    </w:p>
+    <w:p>
+      <w:pPr>
+        <w:rPr/>
+      </w:pPr>
+      <w:r>
+        <w:rPr>
+          <w:rtl w:val="0"/>
+        </w:rPr>
+        <w:t xml:space="preserve">- low-resolution images;</w:t>
+      </w:r>
+    </w:p>
+    <w:p>
+      <w:pPr>
+        <w:rPr/>
+      </w:pPr>
+      <w:r>
+        <w:rPr>
+          <w:rtl w:val="0"/>
+        </w:rPr>
+        <w:t xml:space="preserve">- generic portraits where the depicted person is not relevant to the content;</w:t>
+      </w:r>
+    </w:p>
+    <w:p>
+      <w:pPr>
+        <w:rPr/>
+      </w:pPr>
+      <w:r>
+        <w:rPr>
+          <w:rtl w:val="0"/>
+        </w:rPr>
+        <w:t xml:space="preserve">- images that imply a specific CIT project, result, partner or activity that has not actually occurred;</w:t>
+      </w:r>
+    </w:p>
+    <w:p>
+      <w:pPr>
+        <w:rPr/>
+      </w:pPr>
+      <w:r>
+        <w:rPr>
+          <w:rtl w:val="0"/>
+        </w:rPr>
+        <w:t xml:space="preserve">- UASG website UI screenshots as decorative imagery.</w:t>
+      </w:r>
+    </w:p>
+    <w:p>
+      <w:pPr>
+        <w:rPr/>
+      </w:pPr>
+      <w:r>
+        <w:rPr>
+          <w:rtl w:val="0"/>
+        </w:rPr>
+      </w:r>
+    </w:p>
+    <w:p>
+      <w:pPr>
+        <w:rPr/>
+      </w:pPr>
+      <w:r>
+        <w:rPr>
+          <w:rtl w:val="0"/>
+        </w:rPr>
+        <w:t xml:space="preserve">Cursor implementation rules:</w:t>
+      </w:r>
+    </w:p>
+    <w:p>
+      <w:pPr>
+        <w:rPr/>
+      </w:pPr>
+      <w:r>
+        <w:rPr>
+          <w:rtl w:val="0"/>
+        </w:rPr>
+        <w:t xml:space="preserve">1. Use Cursor's native Browser to inspect uacg.bg on demand and select only the smallest useful set of images for V1.</w:t>
+      </w:r>
+    </w:p>
+    <w:p>
+      <w:pPr>
+        <w:rPr/>
+      </w:pPr>
+      <w:r>
+        <w:rPr>
+          <w:rtl w:val="0"/>
+        </w:rPr>
+        <w:t xml:space="preserve">2. Prefer downloading/localizing permitted public image assets into the project rather than hotlinking them directly from uacg.bg, so the preview is stable. If access/technical restrictions prevent this, use another temporary asset rather than blocking the Goal.</w:t>
+      </w:r>
+    </w:p>
+    <w:p>
+      <w:pPr>
+        <w:rPr/>
+      </w:pPr>
+      <w:r>
+        <w:rPr>
+          <w:rtl w:val="0"/>
+        </w:rPr>
+        <w:t xml:space="preserve">3. Store them in a clearly temporary asset location/naming scheme, for example public/images/temporary-uacg/.</w:t>
+      </w:r>
+    </w:p>
+    <w:p>
+      <w:pPr>
+        <w:rPr/>
+      </w:pPr>
+      <w:r>
+        <w:rPr>
+          <w:rtl w:val="0"/>
+        </w:rPr>
+        <w:t xml:space="preserve">4. Create docs/TEMP_IMAGE_SOURCES.md listing each temporary image filename, source page URL, original image URL when practical, intended placement, and a clear REPLACE BEFORE FINAL PUBLIC LAUNCH note.</w:t>
+      </w:r>
+    </w:p>
+    <w:p>
+      <w:pPr>
+        <w:rPr/>
+      </w:pPr>
+      <w:r>
+        <w:rPr>
+          <w:rtl w:val="0"/>
+        </w:rPr>
+        <w:t xml:space="preserve">5. Do not treat these images as evidence that CIT already owns a laboratory, project, team, result or activity shown in the photograph. They provide institutional/contextual atmosphere only unless the source material explicitly supports the connection.</w:t>
+      </w:r>
+    </w:p>
+    <w:p>
+      <w:pPr>
+        <w:rPr/>
+      </w:pPr>
+      <w:r>
+        <w:rPr>
+          <w:rtl w:val="0"/>
+        </w:rPr>
+        <w:t xml:space="preserve">6. Cropping, responsive art direction and light technical optimization are allowed. Do not materially alter an image in a way that changes what it depicts or creates a false factual implication.</w:t>
+      </w:r>
+    </w:p>
+    <w:p>
+      <w:pPr>
+        <w:rPr/>
+      </w:pPr>
+      <w:r>
+        <w:rPr>
+          <w:rtl w:val="0"/>
+        </w:rPr>
+        <w:t xml:space="preserve">7. Do not let temporary UASG photography override the selected original CIT visual system. The image treatment, crop ratios, spacing and composition should still follow the CIT design system.</w:t>
+      </w:r>
+    </w:p>
+    <w:p>
+      <w:pPr>
+        <w:rPr/>
+      </w:pPr>
+      <w:r>
+        <w:rPr>
+          <w:rtl w:val="0"/>
+        </w:rPr>
+        <w:t xml:space="preserve">8. If a better original or purpose-made CIT asset is available during the run, prefer it. Temporary UASG images are a practical fallback, not a permanent brand decision.</w:t>
+      </w:r>
+    </w:p>
+    <w:p>
+      <w:pPr>
+        <w:rPr/>
+      </w:pPr>
+      <w:r>
+        <w:rPr>
+          <w:rtl w:val="0"/>
+        </w:rPr>
+      </w:r>
+    </w:p>
+    <w:p>
+      <w:pPr>
+        <w:rPr/>
+      </w:pPr>
+      <w:r>
+        <w:rPr>
+          <w:rtl w:val="0"/>
+        </w:rPr>
+        <w:t xml:space="preserve">The presence of temporary UASG images is acceptable for the V1 review/preview Definition of Done as long as they are clearly tracked for later replacement and do not create misleading claims.</w:t>
+      </w:r>
+    </w:p>
+    <w:p>
+      <w:pPr>
+        <w:rPr/>
+      </w:pPr>
+      <w:r>
+        <w:rPr>
+          <w:rtl w:val="0"/>
+        </w:rPr>
       </w:r>
     </w:p>
     <w:p>

</xml_diff>